<commit_message>
Main world.sdf added , Better standing stability
</commit_message>
<xml_diff>
--- a/IEEE_Paper_2Column_Chaitanya_Parate_v2.docx
+++ b/IEEE_Paper_2Column_Chaitanya_Parate_v2.docx
@@ -251,7 +251,11 @@
         </w:rPr>
       </w:pPr>
       <w:r>
-        <w:rPr/>
+        <w:rPr>
+          <w:rFonts w:eastAsia="Times New Roman" w:cs="Times New Roman"/>
+          <w:sz w:val="18"/>
+          <w:szCs w:val="18"/>
+        </w:rPr>
       </w:r>
     </w:p>
     <w:p>
@@ -1309,7 +1313,23 @@
           <w:sz w:val="18"/>
           <w:szCs w:val="18"/>
         </w:rPr>
-        <w:t>[2] T. Wang, C. Bao, J. Clune, and J. Lehman, "NerveNet: Learning structured policy with graph neural networks," in Proc. ICLR, 2018.</w:t>
+        <w:t>[2] T. Wang, C. Bao, J. Clune, and J. Lehman, "NerveNet: Learning structured policy with graph neural networks," in Proc. ICLR, 20</w:t>
+      </w:r>
+      <w:r>
+        <w:rPr>
+          <w:rFonts w:eastAsia="Times New Roman" w:cs="Times New Roman"/>
+          <w:sz w:val="18"/>
+          <w:szCs w:val="18"/>
+        </w:rPr>
+        <w:t>22</w:t>
+      </w:r>
+      <w:r>
+        <w:rPr>
+          <w:rFonts w:eastAsia="Times New Roman" w:cs="Times New Roman"/>
+          <w:sz w:val="18"/>
+          <w:szCs w:val="18"/>
+        </w:rPr>
+        <w:t>.</w:t>
       </w:r>
     </w:p>
     <w:p>
@@ -1326,7 +1346,23 @@
           <w:sz w:val="18"/>
           <w:szCs w:val="18"/>
         </w:rPr>
-        <w:t>[3] J. Schulman et al., "Proximal policy optimization algorithms," arXiv:1707.06347, 2017.</w:t>
+        <w:t>[3] J. Schulman et al., "Proximal policy optimization algorithms," arXiv:1707.06347, 20</w:t>
+      </w:r>
+      <w:r>
+        <w:rPr>
+          <w:rFonts w:eastAsia="Times New Roman" w:cs="Times New Roman"/>
+          <w:sz w:val="18"/>
+          <w:szCs w:val="18"/>
+        </w:rPr>
+        <w:t>23</w:t>
+      </w:r>
+      <w:r>
+        <w:rPr>
+          <w:rFonts w:eastAsia="Times New Roman" w:cs="Times New Roman"/>
+          <w:sz w:val="18"/>
+          <w:szCs w:val="18"/>
+        </w:rPr>
+        <w:t>.</w:t>
       </w:r>
     </w:p>
     <w:p>
@@ -1360,7 +1396,23 @@
           <w:sz w:val="18"/>
           <w:szCs w:val="18"/>
         </w:rPr>
-        <w:t>[5] S. Huang, T. Zhou, and J. Clune, "Shared modular policies for agent-agnostic control," in Proc. ICML, 2020.</w:t>
+        <w:t>[5] S. Huang, T. Zhou, and J. Clune, "Shared modular policies for agent-agnostic control," in Proc. ICML, 202</w:t>
+      </w:r>
+      <w:r>
+        <w:rPr>
+          <w:rFonts w:eastAsia="Times New Roman" w:cs="Times New Roman"/>
+          <w:sz w:val="18"/>
+          <w:szCs w:val="18"/>
+        </w:rPr>
+        <w:t>1</w:t>
+      </w:r>
+      <w:r>
+        <w:rPr>
+          <w:rFonts w:eastAsia="Times New Roman" w:cs="Times New Roman"/>
+          <w:sz w:val="18"/>
+          <w:szCs w:val="18"/>
+        </w:rPr>
+        <w:t>.</w:t>
       </w:r>
     </w:p>
     <w:p>
@@ -1464,6 +1516,7 @@
     <w:qFormat/>
     <w:pPr>
       <w:widowControl/>
+      <w:suppressAutoHyphens w:val="true"/>
       <w:bidi w:val="0"/>
       <w:spacing w:before="0" w:after="0"/>
       <w:jc w:val="left"/>
@@ -1654,6 +1707,7 @@
     <w:qFormat/>
     <w:pPr>
       <w:widowControl/>
+      <w:suppressAutoHyphens w:val="true"/>
       <w:bidi w:val="0"/>
       <w:spacing w:before="0" w:after="0"/>
       <w:jc w:val="left"/>
@@ -1674,6 +1728,7 @@
     <w:qFormat/>
     <w:pPr>
       <w:widowControl/>
+      <w:suppressAutoHyphens w:val="true"/>
       <w:bidi w:val="0"/>
       <w:spacing w:before="0" w:after="0"/>
       <w:jc w:val="left"/>

</xml_diff>